<commit_message>
templates: implement S1 CL1 institutional review feedback
Update the Business Case and Deployment Report student templates per feedback
from the S1 CL1 institutional review process.

Co-Authored-By: Claude Opus 4.8 (1M context) <noreply@anthropic.com>
</commit_message>
<xml_diff>
--- a/public/templates/YAT-Business-Case-Template.docx
+++ b/public/templates/YAT-Business-Case-Template.docx
@@ -484,13 +484,30 @@
       </w:r>
     </w:p>
     <w:p>
+      <w:pPr>
+        <w:rPr>
+          <w:i/>
+          <w:color w:val="6B6660"/>
+          <w:sz w:val="19"/>
+        </w:rPr>
+      </w:pPr>
+      <w:r>
+        <w:rPr>
+          <w:i/>
+          <w:color w:val="EE0000"/>
+          <w:sz w:val="19"/>
+        </w:rPr>
+        <w:t xml:space="preserve">Write this section last. </w:t>
+      </w:r>
+    </w:p>
+    <w:p>
       <w:r>
         <w:rPr>
           <w:i/>
           <w:color w:val="6B6660"/>
           <w:sz w:val="19"/>
         </w:rPr>
-        <w:t>Write this section last. One page the board reads first: the problem in a sentence; the options considered; your recommendation; the high-level 5-year cost position for each option; the top 2–3 risks of the recommended option and how you'll manage them; and the decision you are asking the board to take today.</w:t>
+        <w:t>One page the board reads first: the problem in a sentence; the options considered; your recommendation; the high-level 5-year cost position for each option; the top 2–3 risks of the recommended option and how you'll manage them; and the decision you are asking the board to take today.</w:t>
       </w:r>
     </w:p>
     <w:p>
@@ -6385,7 +6402,62 @@
       </w:r>
       <w:bookmarkEnd w:id="0"/>
       <w:r>
-        <w:t xml:space="preserve"> (For S1 CL1 AT1 Only)</w:t>
+        <w:t xml:space="preserve"> (S1 CL1 AT1 </w:t>
+      </w:r>
+      <w:r>
+        <w:t>o</w:t>
+      </w:r>
+      <w:r>
+        <w:t>nly)</w:t>
+      </w:r>
+    </w:p>
+    <w:p>
+      <w:pPr>
+        <w:rPr>
+          <w:color w:val="EE0000"/>
+          <w:sz w:val="19"/>
+          <w:szCs w:val="21"/>
+        </w:rPr>
+      </w:pPr>
+      <w:r>
+        <w:rPr>
+          <w:color w:val="EE0000"/>
+          <w:sz w:val="19"/>
+          <w:szCs w:val="21"/>
+        </w:rPr>
+        <w:t>(for assessments</w:t>
+      </w:r>
+      <w:r>
+        <w:rPr>
+          <w:color w:val="EE0000"/>
+          <w:sz w:val="19"/>
+          <w:szCs w:val="21"/>
+        </w:rPr>
+        <w:t>/tests</w:t>
+      </w:r>
+      <w:r>
+        <w:rPr>
+          <w:color w:val="EE0000"/>
+          <w:sz w:val="19"/>
+          <w:szCs w:val="21"/>
+        </w:rPr>
+        <w:t xml:space="preserve"> other than S1 CL1 AT</w:t>
+      </w:r>
+      <w:r>
+        <w:rPr>
+          <w:color w:val="EE0000"/>
+          <w:sz w:val="19"/>
+          <w:szCs w:val="21"/>
+        </w:rPr>
+        <w:t>1</w:t>
+      </w:r>
+      <w:r>
+        <w:rPr>
+          <w:color w:val="EE0000"/>
+          <w:sz w:val="19"/>
+          <w:szCs w:val="21"/>
+        </w:rPr>
+        <w:t xml:space="preserve"> delete this section)</w:t>
       </w:r>
     </w:p>
     <w:p>
@@ -6791,7 +6863,15 @@
                 <w:bCs/>
                 <w:sz w:val="18"/>
               </w:rPr>
-              <w:t xml:space="preserve"> changes, schedule/dependencies, standards &amp; targets, methods, change-management alignment, risks/owners) appears in your own plan.</w:t>
+              <w:t xml:space="preserve"> changes, schedule/dependencies, standards &amp; targets, methods, change-management alignment, </w:t>
+            </w:r>
+            <w:r>
+              <w:rPr>
+                <w:bCs/>
+                <w:sz w:val="18"/>
+              </w:rPr>
+              <w:lastRenderedPageBreak/>
+              <w:t>risks/owners) appears in your own plan.</w:t>
             </w:r>
           </w:p>
         </w:tc>
@@ -6833,15 +6913,7 @@
                 <w:bCs/>
                 <w:sz w:val="18"/>
               </w:rPr>
-              <w:lastRenderedPageBreak/>
-              <w:t xml:space="preserve">Q7. </w:t>
-            </w:r>
-            <w:r>
-              <w:rPr>
-                <w:bCs/>
-                <w:sz w:val="18"/>
-              </w:rPr>
-              <w:t>Which evaluation and planning methods did you apply in reaching your recommendation, and where in your Business Case is each one used?</w:t>
+              <w:t>Q7. Which evaluation and planning methods did you apply in reaching your recommendation, and where in your Business Case is each one used?</w:t>
             </w:r>
           </w:p>
         </w:tc>
@@ -7035,16 +7107,7 @@
         <w:pStyle w:val="Heading1"/>
       </w:pPr>
       <w:r>
-        <w:t xml:space="preserve">Appendix </w:t>
-      </w:r>
-      <w:r>
-        <w:t>4</w:t>
-      </w:r>
-      <w:r>
-        <w:t xml:space="preserve"> — </w:t>
-      </w:r>
-      <w:r>
-        <w:t>Feedback Record</w:t>
+        <w:t>Appendix 4 — Feedback Record</w:t>
       </w:r>
     </w:p>
     <w:p>
@@ -7054,15 +7117,7 @@
           <w:color w:val="6B6660"/>
           <w:sz w:val="19"/>
         </w:rPr>
-        <w:t xml:space="preserve">Attach </w:t>
-      </w:r>
-      <w:r>
-        <w:rPr>
-          <w:i/>
-          <w:color w:val="6B6660"/>
-          <w:sz w:val="19"/>
-        </w:rPr>
-        <w:t>the completed YAT feedback record document completed during / after your presentation</w:t>
+        <w:t>Attach the completed YAT feedback record document completed during / after your presentation</w:t>
       </w:r>
     </w:p>
     <w:p>
@@ -7071,14 +7126,7 @@
           <w:i/>
           <w:color w:val="6B6660"/>
         </w:rPr>
-        <w:t xml:space="preserve">[ </w:t>
-      </w:r>
-      <w:r>
-        <w:rPr>
-          <w:i/>
-          <w:color w:val="6B6660"/>
-        </w:rPr>
-        <w:t xml:space="preserve">Feedback </w:t>
+        <w:t xml:space="preserve">[ Feedback </w:t>
       </w:r>
       <w:r>
         <w:rPr>
@@ -7092,14 +7140,7 @@
           <w:i/>
           <w:color w:val="6B6660"/>
         </w:rPr>
-        <w:t>ecord</w:t>
-      </w:r>
-      <w:r>
-        <w:rPr>
-          <w:i/>
-          <w:color w:val="6B6660"/>
-        </w:rPr>
-        <w:t>]</w:t>
+        <w:t>ecord]</w:t>
       </w:r>
     </w:p>
     <w:p/>

</xml_diff>